<commit_message>
docs: atualizar relatorio e registrar aceite da entrega
</commit_message>
<xml_diff>
--- a/docs/entrega/relatorio-liveb-geo.docx
+++ b/docs/entrega/relatorio-liveb-geo.docx
@@ -268,7 +268,13 @@
           <w:tab w:val="right" w:leader="dot" w:pos="9061"/>
         </w:tabs>
         <w:rPr>
+          <w:rFonts w:asciiTheme="minorHAnsi" w:eastAsiaTheme="minorEastAsia" w:hAnsiTheme="minorHAnsi" w:cstheme="minorBidi"/>
           <w:noProof/>
+          <w:color w:val="auto"/>
+          <w:kern w:val="2"/>
+          <w:szCs w:val="24"/>
+          <w:lang w:val="pt-BR" w:eastAsia="pt-BR"/>
+          <w14:ligatures w14:val="standardContextual"/>
         </w:rPr>
       </w:pPr>
       <w:r>
@@ -280,7 +286,7 @@
       <w:r>
         <w:fldChar w:fldCharType="separate"/>
       </w:r>
-      <w:hyperlink w:anchor="_Toc241917348" w:history="1">
+      <w:hyperlink w:anchor="_Toc241925005" w:history="1">
         <w:r>
           <w:rPr>
             <w:rStyle w:val="Hyperlink"/>
@@ -307,7 +313,7 @@
             <w:noProof/>
             <w:webHidden/>
           </w:rPr>
-          <w:instrText xml:space="preserve"> PAGEREF _Toc241917348 \h </w:instrText>
+          <w:instrText xml:space="preserve"> PAGEREF _Toc241925005 \h </w:instrText>
         </w:r>
         <w:r>
           <w:rPr>
@@ -345,10 +351,16 @@
           <w:tab w:val="right" w:leader="dot" w:pos="9061"/>
         </w:tabs>
         <w:rPr>
+          <w:rFonts w:asciiTheme="minorHAnsi" w:eastAsiaTheme="minorEastAsia" w:hAnsiTheme="minorHAnsi" w:cstheme="minorBidi"/>
           <w:noProof/>
+          <w:color w:val="auto"/>
+          <w:kern w:val="2"/>
+          <w:szCs w:val="24"/>
+          <w:lang w:val="pt-BR" w:eastAsia="pt-BR"/>
+          <w14:ligatures w14:val="standardContextual"/>
         </w:rPr>
       </w:pPr>
-      <w:hyperlink w:anchor="_Toc241917349" w:history="1">
+      <w:hyperlink w:anchor="_Toc241925006" w:history="1">
         <w:r>
           <w:rPr>
             <w:rStyle w:val="Hyperlink"/>
@@ -375,7 +387,7 @@
             <w:noProof/>
             <w:webHidden/>
           </w:rPr>
-          <w:instrText xml:space="preserve"> PAGEREF _Toc241917349 \h </w:instrText>
+          <w:instrText xml:space="preserve"> PAGEREF _Toc241925006 \h </w:instrText>
         </w:r>
         <w:r>
           <w:rPr>
@@ -413,10 +425,16 @@
           <w:tab w:val="right" w:leader="dot" w:pos="9061"/>
         </w:tabs>
         <w:rPr>
+          <w:rFonts w:asciiTheme="minorHAnsi" w:eastAsiaTheme="minorEastAsia" w:hAnsiTheme="minorHAnsi" w:cstheme="minorBidi"/>
           <w:noProof/>
+          <w:color w:val="auto"/>
+          <w:kern w:val="2"/>
+          <w:szCs w:val="24"/>
+          <w:lang w:val="pt-BR" w:eastAsia="pt-BR"/>
+          <w14:ligatures w14:val="standardContextual"/>
         </w:rPr>
       </w:pPr>
-      <w:hyperlink w:anchor="_Toc241917350" w:history="1">
+      <w:hyperlink w:anchor="_Toc241925007" w:history="1">
         <w:r>
           <w:rPr>
             <w:rStyle w:val="Hyperlink"/>
@@ -443,7 +461,7 @@
             <w:noProof/>
             <w:webHidden/>
           </w:rPr>
-          <w:instrText xml:space="preserve"> PAGEREF _Toc241917350 \h </w:instrText>
+          <w:instrText xml:space="preserve"> PAGEREF _Toc241925007 \h </w:instrText>
         </w:r>
         <w:r>
           <w:rPr>
@@ -481,10 +499,16 @@
           <w:tab w:val="right" w:leader="dot" w:pos="9061"/>
         </w:tabs>
         <w:rPr>
+          <w:rFonts w:asciiTheme="minorHAnsi" w:eastAsiaTheme="minorEastAsia" w:hAnsiTheme="minorHAnsi" w:cstheme="minorBidi"/>
           <w:noProof/>
+          <w:color w:val="auto"/>
+          <w:kern w:val="2"/>
+          <w:szCs w:val="24"/>
+          <w:lang w:val="pt-BR" w:eastAsia="pt-BR"/>
+          <w14:ligatures w14:val="standardContextual"/>
         </w:rPr>
       </w:pPr>
-      <w:hyperlink w:anchor="_Toc241917351" w:history="1">
+      <w:hyperlink w:anchor="_Toc241925008" w:history="1">
         <w:r>
           <w:rPr>
             <w:rStyle w:val="Hyperlink"/>
@@ -511,7 +535,7 @@
             <w:noProof/>
             <w:webHidden/>
           </w:rPr>
-          <w:instrText xml:space="preserve"> PAGEREF _Toc241917351 \h </w:instrText>
+          <w:instrText xml:space="preserve"> PAGEREF _Toc241925008 \h </w:instrText>
         </w:r>
         <w:r>
           <w:rPr>
@@ -549,10 +573,16 @@
           <w:tab w:val="right" w:leader="dot" w:pos="9061"/>
         </w:tabs>
         <w:rPr>
+          <w:rFonts w:asciiTheme="minorHAnsi" w:eastAsiaTheme="minorEastAsia" w:hAnsiTheme="minorHAnsi" w:cstheme="minorBidi"/>
           <w:noProof/>
+          <w:color w:val="auto"/>
+          <w:kern w:val="2"/>
+          <w:szCs w:val="24"/>
+          <w:lang w:val="pt-BR" w:eastAsia="pt-BR"/>
+          <w14:ligatures w14:val="standardContextual"/>
         </w:rPr>
       </w:pPr>
-      <w:hyperlink w:anchor="_Toc241917352" w:history="1">
+      <w:hyperlink w:anchor="_Toc241925009" w:history="1">
         <w:r>
           <w:rPr>
             <w:rStyle w:val="Hyperlink"/>
@@ -579,7 +609,7 @@
             <w:noProof/>
             <w:webHidden/>
           </w:rPr>
-          <w:instrText xml:space="preserve"> PAGEREF _Toc241917352 \h </w:instrText>
+          <w:instrText xml:space="preserve"> PAGEREF _Toc241925009 \h </w:instrText>
         </w:r>
         <w:r>
           <w:rPr>
@@ -617,10 +647,16 @@
           <w:tab w:val="right" w:leader="dot" w:pos="9061"/>
         </w:tabs>
         <w:rPr>
+          <w:rFonts w:asciiTheme="minorHAnsi" w:eastAsiaTheme="minorEastAsia" w:hAnsiTheme="minorHAnsi" w:cstheme="minorBidi"/>
           <w:noProof/>
+          <w:color w:val="auto"/>
+          <w:kern w:val="2"/>
+          <w:szCs w:val="24"/>
+          <w:lang w:val="pt-BR" w:eastAsia="pt-BR"/>
+          <w14:ligatures w14:val="standardContextual"/>
         </w:rPr>
       </w:pPr>
-      <w:hyperlink w:anchor="_Toc241917353" w:history="1">
+      <w:hyperlink w:anchor="_Toc241925010" w:history="1">
         <w:r>
           <w:rPr>
             <w:rStyle w:val="Hyperlink"/>
@@ -647,7 +683,7 @@
             <w:noProof/>
             <w:webHidden/>
           </w:rPr>
-          <w:instrText xml:space="preserve"> PAGEREF _Toc241917353 \h </w:instrText>
+          <w:instrText xml:space="preserve"> PAGEREF _Toc241925010 \h </w:instrText>
         </w:r>
         <w:r>
           <w:rPr>
@@ -685,10 +721,16 @@
           <w:tab w:val="right" w:leader="dot" w:pos="9061"/>
         </w:tabs>
         <w:rPr>
+          <w:rFonts w:asciiTheme="minorHAnsi" w:eastAsiaTheme="minorEastAsia" w:hAnsiTheme="minorHAnsi" w:cstheme="minorBidi"/>
           <w:noProof/>
+          <w:color w:val="auto"/>
+          <w:kern w:val="2"/>
+          <w:szCs w:val="24"/>
+          <w:lang w:val="pt-BR" w:eastAsia="pt-BR"/>
+          <w14:ligatures w14:val="standardContextual"/>
         </w:rPr>
       </w:pPr>
-      <w:hyperlink w:anchor="_Toc241917354" w:history="1">
+      <w:hyperlink w:anchor="_Toc241925011" w:history="1">
         <w:r>
           <w:rPr>
             <w:rStyle w:val="Hyperlink"/>
@@ -715,7 +757,7 @@
             <w:noProof/>
             <w:webHidden/>
           </w:rPr>
-          <w:instrText xml:space="preserve"> PAGEREF _Toc241917354 \h </w:instrText>
+          <w:instrText xml:space="preserve"> PAGEREF _Toc241925011 \h </w:instrText>
         </w:r>
         <w:r>
           <w:rPr>
@@ -753,10 +795,16 @@
           <w:tab w:val="right" w:leader="dot" w:pos="9061"/>
         </w:tabs>
         <w:rPr>
+          <w:rFonts w:asciiTheme="minorHAnsi" w:eastAsiaTheme="minorEastAsia" w:hAnsiTheme="minorHAnsi" w:cstheme="minorBidi"/>
           <w:noProof/>
+          <w:color w:val="auto"/>
+          <w:kern w:val="2"/>
+          <w:szCs w:val="24"/>
+          <w:lang w:val="pt-BR" w:eastAsia="pt-BR"/>
+          <w14:ligatures w14:val="standardContextual"/>
         </w:rPr>
       </w:pPr>
-      <w:hyperlink w:anchor="_Toc241917355" w:history="1">
+      <w:hyperlink w:anchor="_Toc241925012" w:history="1">
         <w:r>
           <w:rPr>
             <w:rStyle w:val="Hyperlink"/>
@@ -783,7 +831,7 @@
             <w:noProof/>
             <w:webHidden/>
           </w:rPr>
-          <w:instrText xml:space="preserve"> PAGEREF _Toc241917355 \h </w:instrText>
+          <w:instrText xml:space="preserve"> PAGEREF _Toc241925012 \h </w:instrText>
         </w:r>
         <w:r>
           <w:rPr>
@@ -821,10 +869,16 @@
           <w:tab w:val="right" w:leader="dot" w:pos="9061"/>
         </w:tabs>
         <w:rPr>
+          <w:rFonts w:asciiTheme="minorHAnsi" w:eastAsiaTheme="minorEastAsia" w:hAnsiTheme="minorHAnsi" w:cstheme="minorBidi"/>
           <w:noProof/>
+          <w:color w:val="auto"/>
+          <w:kern w:val="2"/>
+          <w:szCs w:val="24"/>
+          <w:lang w:val="pt-BR" w:eastAsia="pt-BR"/>
+          <w14:ligatures w14:val="standardContextual"/>
         </w:rPr>
       </w:pPr>
-      <w:hyperlink w:anchor="_Toc241917356" w:history="1">
+      <w:hyperlink w:anchor="_Toc241925013" w:history="1">
         <w:r>
           <w:rPr>
             <w:rStyle w:val="Hyperlink"/>
@@ -851,7 +905,7 @@
             <w:noProof/>
             <w:webHidden/>
           </w:rPr>
-          <w:instrText xml:space="preserve"> PAGEREF _Toc241917356 \h </w:instrText>
+          <w:instrText xml:space="preserve"> PAGEREF _Toc241925013 \h </w:instrText>
         </w:r>
         <w:r>
           <w:rPr>
@@ -889,10 +943,16 @@
           <w:tab w:val="right" w:leader="dot" w:pos="9061"/>
         </w:tabs>
         <w:rPr>
+          <w:rFonts w:asciiTheme="minorHAnsi" w:eastAsiaTheme="minorEastAsia" w:hAnsiTheme="minorHAnsi" w:cstheme="minorBidi"/>
           <w:noProof/>
+          <w:color w:val="auto"/>
+          <w:kern w:val="2"/>
+          <w:szCs w:val="24"/>
+          <w:lang w:val="pt-BR" w:eastAsia="pt-BR"/>
+          <w14:ligatures w14:val="standardContextual"/>
         </w:rPr>
       </w:pPr>
-      <w:hyperlink w:anchor="_Toc241917357" w:history="1">
+      <w:hyperlink w:anchor="_Toc241925014" w:history="1">
         <w:r>
           <w:rPr>
             <w:rStyle w:val="Hyperlink"/>
@@ -919,7 +979,7 @@
             <w:noProof/>
             <w:webHidden/>
           </w:rPr>
-          <w:instrText xml:space="preserve"> PAGEREF _Toc241917357 \h </w:instrText>
+          <w:instrText xml:space="preserve"> PAGEREF _Toc241925014 \h </w:instrText>
         </w:r>
         <w:r>
           <w:rPr>
@@ -957,10 +1017,16 @@
           <w:tab w:val="right" w:leader="dot" w:pos="9061"/>
         </w:tabs>
         <w:rPr>
+          <w:rFonts w:asciiTheme="minorHAnsi" w:eastAsiaTheme="minorEastAsia" w:hAnsiTheme="minorHAnsi" w:cstheme="minorBidi"/>
           <w:noProof/>
+          <w:color w:val="auto"/>
+          <w:kern w:val="2"/>
+          <w:szCs w:val="24"/>
+          <w:lang w:val="pt-BR" w:eastAsia="pt-BR"/>
+          <w14:ligatures w14:val="standardContextual"/>
         </w:rPr>
       </w:pPr>
-      <w:hyperlink w:anchor="_Toc241917358" w:history="1">
+      <w:hyperlink w:anchor="_Toc241925015" w:history="1">
         <w:r>
           <w:rPr>
             <w:rStyle w:val="Hyperlink"/>
@@ -987,7 +1053,7 @@
             <w:noProof/>
             <w:webHidden/>
           </w:rPr>
-          <w:instrText xml:space="preserve"> PAGEREF _Toc241917358 \h </w:instrText>
+          <w:instrText xml:space="preserve"> PAGEREF _Toc241925015 \h </w:instrText>
         </w:r>
         <w:r>
           <w:rPr>
@@ -1025,10 +1091,16 @@
           <w:tab w:val="right" w:leader="dot" w:pos="9061"/>
         </w:tabs>
         <w:rPr>
+          <w:rFonts w:asciiTheme="minorHAnsi" w:eastAsiaTheme="minorEastAsia" w:hAnsiTheme="minorHAnsi" w:cstheme="minorBidi"/>
           <w:noProof/>
+          <w:color w:val="auto"/>
+          <w:kern w:val="2"/>
+          <w:szCs w:val="24"/>
+          <w:lang w:val="pt-BR" w:eastAsia="pt-BR"/>
+          <w14:ligatures w14:val="standardContextual"/>
         </w:rPr>
       </w:pPr>
-      <w:hyperlink w:anchor="_Toc241917359" w:history="1">
+      <w:hyperlink w:anchor="_Toc241925016" w:history="1">
         <w:r>
           <w:rPr>
             <w:rStyle w:val="Hyperlink"/>
@@ -1055,7 +1127,7 @@
             <w:noProof/>
             <w:webHidden/>
           </w:rPr>
-          <w:instrText xml:space="preserve"> PAGEREF _Toc241917359 \h </w:instrText>
+          <w:instrText xml:space="preserve"> PAGEREF _Toc241925016 \h </w:instrText>
         </w:r>
         <w:r>
           <w:rPr>
@@ -1093,10 +1165,16 @@
           <w:tab w:val="right" w:leader="dot" w:pos="9061"/>
         </w:tabs>
         <w:rPr>
+          <w:rFonts w:asciiTheme="minorHAnsi" w:eastAsiaTheme="minorEastAsia" w:hAnsiTheme="minorHAnsi" w:cstheme="minorBidi"/>
           <w:noProof/>
+          <w:color w:val="auto"/>
+          <w:kern w:val="2"/>
+          <w:szCs w:val="24"/>
+          <w:lang w:val="pt-BR" w:eastAsia="pt-BR"/>
+          <w14:ligatures w14:val="standardContextual"/>
         </w:rPr>
       </w:pPr>
-      <w:hyperlink w:anchor="_Toc241917360" w:history="1">
+      <w:hyperlink w:anchor="_Toc241925017" w:history="1">
         <w:r>
           <w:rPr>
             <w:rStyle w:val="Hyperlink"/>
@@ -1123,7 +1201,7 @@
             <w:noProof/>
             <w:webHidden/>
           </w:rPr>
-          <w:instrText xml:space="preserve"> PAGEREF _Toc241917360 \h </w:instrText>
+          <w:instrText xml:space="preserve"> PAGEREF _Toc241925017 \h </w:instrText>
         </w:r>
         <w:r>
           <w:rPr>
@@ -1161,10 +1239,16 @@
           <w:tab w:val="right" w:leader="dot" w:pos="9061"/>
         </w:tabs>
         <w:rPr>
+          <w:rFonts w:asciiTheme="minorHAnsi" w:eastAsiaTheme="minorEastAsia" w:hAnsiTheme="minorHAnsi" w:cstheme="minorBidi"/>
           <w:noProof/>
+          <w:color w:val="auto"/>
+          <w:kern w:val="2"/>
+          <w:szCs w:val="24"/>
+          <w:lang w:val="pt-BR" w:eastAsia="pt-BR"/>
+          <w14:ligatures w14:val="standardContextual"/>
         </w:rPr>
       </w:pPr>
-      <w:hyperlink w:anchor="_Toc241917361" w:history="1">
+      <w:hyperlink w:anchor="_Toc241925018" w:history="1">
         <w:r>
           <w:rPr>
             <w:rStyle w:val="Hyperlink"/>
@@ -1191,7 +1275,7 @@
             <w:noProof/>
             <w:webHidden/>
           </w:rPr>
-          <w:instrText xml:space="preserve"> PAGEREF _Toc241917361 \h </w:instrText>
+          <w:instrText xml:space="preserve"> PAGEREF _Toc241925018 \h </w:instrText>
         </w:r>
         <w:r>
           <w:rPr>
@@ -1229,10 +1313,16 @@
           <w:tab w:val="right" w:leader="dot" w:pos="9061"/>
         </w:tabs>
         <w:rPr>
+          <w:rFonts w:asciiTheme="minorHAnsi" w:eastAsiaTheme="minorEastAsia" w:hAnsiTheme="minorHAnsi" w:cstheme="minorBidi"/>
           <w:noProof/>
+          <w:color w:val="auto"/>
+          <w:kern w:val="2"/>
+          <w:szCs w:val="24"/>
+          <w:lang w:val="pt-BR" w:eastAsia="pt-BR"/>
+          <w14:ligatures w14:val="standardContextual"/>
         </w:rPr>
       </w:pPr>
-      <w:hyperlink w:anchor="_Toc241917362" w:history="1">
+      <w:hyperlink w:anchor="_Toc241925019" w:history="1">
         <w:r>
           <w:rPr>
             <w:rStyle w:val="Hyperlink"/>
@@ -1259,7 +1349,7 @@
             <w:noProof/>
             <w:webHidden/>
           </w:rPr>
-          <w:instrText xml:space="preserve"> PAGEREF _Toc241917362 \h </w:instrText>
+          <w:instrText xml:space="preserve"> PAGEREF _Toc241925019 \h </w:instrText>
         </w:r>
         <w:r>
           <w:rPr>
@@ -1297,10 +1387,16 @@
           <w:tab w:val="right" w:leader="dot" w:pos="9061"/>
         </w:tabs>
         <w:rPr>
+          <w:rFonts w:asciiTheme="minorHAnsi" w:eastAsiaTheme="minorEastAsia" w:hAnsiTheme="minorHAnsi" w:cstheme="minorBidi"/>
           <w:noProof/>
+          <w:color w:val="auto"/>
+          <w:kern w:val="2"/>
+          <w:szCs w:val="24"/>
+          <w:lang w:val="pt-BR" w:eastAsia="pt-BR"/>
+          <w14:ligatures w14:val="standardContextual"/>
         </w:rPr>
       </w:pPr>
-      <w:hyperlink w:anchor="_Toc241917363" w:history="1">
+      <w:hyperlink w:anchor="_Toc241925020" w:history="1">
         <w:r>
           <w:rPr>
             <w:rStyle w:val="Hyperlink"/>
@@ -1327,7 +1423,7 @@
             <w:noProof/>
             <w:webHidden/>
           </w:rPr>
-          <w:instrText xml:space="preserve"> PAGEREF _Toc241917363 \h </w:instrText>
+          <w:instrText xml:space="preserve"> PAGEREF _Toc241925020 \h </w:instrText>
         </w:r>
         <w:r>
           <w:rPr>
@@ -1365,10 +1461,16 @@
           <w:tab w:val="right" w:leader="dot" w:pos="9061"/>
         </w:tabs>
         <w:rPr>
+          <w:rFonts w:asciiTheme="minorHAnsi" w:eastAsiaTheme="minorEastAsia" w:hAnsiTheme="minorHAnsi" w:cstheme="minorBidi"/>
           <w:noProof/>
+          <w:color w:val="auto"/>
+          <w:kern w:val="2"/>
+          <w:szCs w:val="24"/>
+          <w:lang w:val="pt-BR" w:eastAsia="pt-BR"/>
+          <w14:ligatures w14:val="standardContextual"/>
         </w:rPr>
       </w:pPr>
-      <w:hyperlink w:anchor="_Toc241917364" w:history="1">
+      <w:hyperlink w:anchor="_Toc241925021" w:history="1">
         <w:r>
           <w:rPr>
             <w:rStyle w:val="Hyperlink"/>
@@ -1395,7 +1497,7 @@
             <w:noProof/>
             <w:webHidden/>
           </w:rPr>
-          <w:instrText xml:space="preserve"> PAGEREF _Toc241917364 \h </w:instrText>
+          <w:instrText xml:space="preserve"> PAGEREF _Toc241925021 \h </w:instrText>
         </w:r>
         <w:r>
           <w:rPr>
@@ -1433,10 +1535,16 @@
           <w:tab w:val="right" w:leader="dot" w:pos="9061"/>
         </w:tabs>
         <w:rPr>
+          <w:rFonts w:asciiTheme="minorHAnsi" w:eastAsiaTheme="minorEastAsia" w:hAnsiTheme="minorHAnsi" w:cstheme="minorBidi"/>
           <w:noProof/>
+          <w:color w:val="auto"/>
+          <w:kern w:val="2"/>
+          <w:szCs w:val="24"/>
+          <w:lang w:val="pt-BR" w:eastAsia="pt-BR"/>
+          <w14:ligatures w14:val="standardContextual"/>
         </w:rPr>
       </w:pPr>
-      <w:hyperlink w:anchor="_Toc241917365" w:history="1">
+      <w:hyperlink w:anchor="_Toc241925022" w:history="1">
         <w:r>
           <w:rPr>
             <w:rStyle w:val="Hyperlink"/>
@@ -1463,7 +1571,7 @@
             <w:noProof/>
             <w:webHidden/>
           </w:rPr>
-          <w:instrText xml:space="preserve"> PAGEREF _Toc241917365 \h </w:instrText>
+          <w:instrText xml:space="preserve"> PAGEREF _Toc241925022 \h </w:instrText>
         </w:r>
         <w:r>
           <w:rPr>
@@ -1501,10 +1609,16 @@
           <w:tab w:val="right" w:leader="dot" w:pos="9061"/>
         </w:tabs>
         <w:rPr>
+          <w:rFonts w:asciiTheme="minorHAnsi" w:eastAsiaTheme="minorEastAsia" w:hAnsiTheme="minorHAnsi" w:cstheme="minorBidi"/>
           <w:noProof/>
+          <w:color w:val="auto"/>
+          <w:kern w:val="2"/>
+          <w:szCs w:val="24"/>
+          <w:lang w:val="pt-BR" w:eastAsia="pt-BR"/>
+          <w14:ligatures w14:val="standardContextual"/>
         </w:rPr>
       </w:pPr>
-      <w:hyperlink w:anchor="_Toc241917366" w:history="1">
+      <w:hyperlink w:anchor="_Toc241925023" w:history="1">
         <w:r>
           <w:rPr>
             <w:rStyle w:val="Hyperlink"/>
@@ -1531,7 +1645,7 @@
             <w:noProof/>
             <w:webHidden/>
           </w:rPr>
-          <w:instrText xml:space="preserve"> PAGEREF _Toc241917366 \h </w:instrText>
+          <w:instrText xml:space="preserve"> PAGEREF _Toc241925023 \h </w:instrText>
         </w:r>
         <w:r>
           <w:rPr>
@@ -1569,10 +1683,16 @@
           <w:tab w:val="right" w:leader="dot" w:pos="9061"/>
         </w:tabs>
         <w:rPr>
+          <w:rFonts w:asciiTheme="minorHAnsi" w:eastAsiaTheme="minorEastAsia" w:hAnsiTheme="minorHAnsi" w:cstheme="minorBidi"/>
           <w:noProof/>
+          <w:color w:val="auto"/>
+          <w:kern w:val="2"/>
+          <w:szCs w:val="24"/>
+          <w:lang w:val="pt-BR" w:eastAsia="pt-BR"/>
+          <w14:ligatures w14:val="standardContextual"/>
         </w:rPr>
       </w:pPr>
-      <w:hyperlink w:anchor="_Toc241917367" w:history="1">
+      <w:hyperlink w:anchor="_Toc241925024" w:history="1">
         <w:r>
           <w:rPr>
             <w:rStyle w:val="Hyperlink"/>
@@ -1599,7 +1719,7 @@
             <w:noProof/>
             <w:webHidden/>
           </w:rPr>
-          <w:instrText xml:space="preserve"> PAGEREF _Toc241917367 \h </w:instrText>
+          <w:instrText xml:space="preserve"> PAGEREF _Toc241925024 \h </w:instrText>
         </w:r>
         <w:r>
           <w:rPr>
@@ -1637,10 +1757,16 @@
           <w:tab w:val="right" w:leader="dot" w:pos="9061"/>
         </w:tabs>
         <w:rPr>
+          <w:rFonts w:asciiTheme="minorHAnsi" w:eastAsiaTheme="minorEastAsia" w:hAnsiTheme="minorHAnsi" w:cstheme="minorBidi"/>
           <w:noProof/>
+          <w:color w:val="auto"/>
+          <w:kern w:val="2"/>
+          <w:szCs w:val="24"/>
+          <w:lang w:val="pt-BR" w:eastAsia="pt-BR"/>
+          <w14:ligatures w14:val="standardContextual"/>
         </w:rPr>
       </w:pPr>
-      <w:hyperlink w:anchor="_Toc241917368" w:history="1">
+      <w:hyperlink w:anchor="_Toc241925025" w:history="1">
         <w:r>
           <w:rPr>
             <w:rStyle w:val="Hyperlink"/>
@@ -1667,7 +1793,7 @@
             <w:noProof/>
             <w:webHidden/>
           </w:rPr>
-          <w:instrText xml:space="preserve"> PAGEREF _Toc241917368 \h </w:instrText>
+          <w:instrText xml:space="preserve"> PAGEREF _Toc241925025 \h </w:instrText>
         </w:r>
         <w:r>
           <w:rPr>
@@ -1705,10 +1831,16 @@
           <w:tab w:val="right" w:leader="dot" w:pos="9061"/>
         </w:tabs>
         <w:rPr>
+          <w:rFonts w:asciiTheme="minorHAnsi" w:eastAsiaTheme="minorEastAsia" w:hAnsiTheme="minorHAnsi" w:cstheme="minorBidi"/>
           <w:noProof/>
+          <w:color w:val="auto"/>
+          <w:kern w:val="2"/>
+          <w:szCs w:val="24"/>
+          <w:lang w:val="pt-BR" w:eastAsia="pt-BR"/>
+          <w14:ligatures w14:val="standardContextual"/>
         </w:rPr>
       </w:pPr>
-      <w:hyperlink w:anchor="_Toc241917369" w:history="1">
+      <w:hyperlink w:anchor="_Toc241925026" w:history="1">
         <w:r>
           <w:rPr>
             <w:rStyle w:val="Hyperlink"/>
@@ -1735,7 +1867,7 @@
             <w:noProof/>
             <w:webHidden/>
           </w:rPr>
-          <w:instrText xml:space="preserve"> PAGEREF _Toc241917369 \h </w:instrText>
+          <w:instrText xml:space="preserve"> PAGEREF _Toc241925026 \h </w:instrText>
         </w:r>
         <w:r>
           <w:rPr>
@@ -1773,10 +1905,16 @@
           <w:tab w:val="right" w:leader="dot" w:pos="9061"/>
         </w:tabs>
         <w:rPr>
+          <w:rFonts w:asciiTheme="minorHAnsi" w:eastAsiaTheme="minorEastAsia" w:hAnsiTheme="minorHAnsi" w:cstheme="minorBidi"/>
           <w:noProof/>
+          <w:color w:val="auto"/>
+          <w:kern w:val="2"/>
+          <w:szCs w:val="24"/>
+          <w:lang w:val="pt-BR" w:eastAsia="pt-BR"/>
+          <w14:ligatures w14:val="standardContextual"/>
         </w:rPr>
       </w:pPr>
-      <w:hyperlink w:anchor="_Toc241917370" w:history="1">
+      <w:hyperlink w:anchor="_Toc241925027" w:history="1">
         <w:r>
           <w:rPr>
             <w:rStyle w:val="Hyperlink"/>
@@ -1803,7 +1941,7 @@
             <w:noProof/>
             <w:webHidden/>
           </w:rPr>
-          <w:instrText xml:space="preserve"> PAGEREF _Toc241917370 \h </w:instrText>
+          <w:instrText xml:space="preserve"> PAGEREF _Toc241925027 \h </w:instrText>
         </w:r>
         <w:r>
           <w:rPr>
@@ -1860,7 +1998,7 @@
         <w:pStyle w:val="Ttulo1"/>
         <w:pageBreakBefore w:val="0"/>
       </w:pPr>
-      <w:bookmarkStart w:id="0" w:name="_Toc241917348"/>
+      <w:bookmarkStart w:id="0" w:name="_Toc241925005"/>
       <w:r>
         <w:lastRenderedPageBreak/>
         <w:t>1 INTRODUÇÃO</w:t>
@@ -1881,7 +2019,7 @@
       <w:pPr>
         <w:pStyle w:val="Ttulo2"/>
       </w:pPr>
-      <w:bookmarkStart w:id="1" w:name="_Toc241917349"/>
+      <w:bookmarkStart w:id="1" w:name="_Toc241925006"/>
       <w:r>
         <w:t>1.1 Objetivos</w:t>
       </w:r>
@@ -1896,7 +2034,7 @@
       <w:pPr>
         <w:pStyle w:val="Ttulo2"/>
       </w:pPr>
-      <w:bookmarkStart w:id="2" w:name="_Toc241917350"/>
+      <w:bookmarkStart w:id="2" w:name="_Toc241925007"/>
       <w:r>
         <w:t>1.2 Delimitação</w:t>
       </w:r>
@@ -1911,7 +2049,7 @@
       <w:pPr>
         <w:pStyle w:val="Ttulo1"/>
       </w:pPr>
-      <w:bookmarkStart w:id="3" w:name="_Toc241917351"/>
+      <w:bookmarkStart w:id="3" w:name="_Toc241925008"/>
       <w:r>
         <w:lastRenderedPageBreak/>
         <w:t>2 ELICITAÇÃO E ORGANIZAÇÃO DA EQUIPE</w:t>
@@ -2181,7 +2319,7 @@
         <w:pStyle w:val="Ttulo2"/>
         <w:pageBreakBefore/>
       </w:pPr>
-      <w:bookmarkStart w:id="4" w:name="_Toc241917352"/>
+      <w:bookmarkStart w:id="4" w:name="_Toc241925009"/>
       <w:r>
         <w:lastRenderedPageBreak/>
         <w:t>2.1 Usuários identificados</w:t>
@@ -2444,10 +2582,15 @@
       </w:r>
     </w:p>
     <w:p>
+      <w:r>
+        <w:t>A elicitação documentada utilizou entrevista semiestruturada e análise da pauta e da documentação de requisitos. O roteiro da entrevista orientou as perguntas; não há registro de aplicação de questionário independente. As respostas sintetizadas no Apêndice A foram relacionadas aos requisitos e casos de uso, e a inspeção do protótipo permitiu confrontar essas necessidades com os fluxos demonstrados. A matriz de rastreabilidade da seção 4.3 registra essa relação.</w:t>
+      </w:r>
+    </w:p>
+    <w:p>
       <w:pPr>
         <w:pStyle w:val="Ttulo1"/>
       </w:pPr>
-      <w:bookmarkStart w:id="5" w:name="_Toc241917353"/>
+      <w:bookmarkStart w:id="5" w:name="_Toc241925010"/>
       <w:r>
         <w:lastRenderedPageBreak/>
         <w:t>3 ESPECIFICAÇÃO DE REQUISITOS</w:t>
@@ -2463,7 +2606,7 @@
       <w:pPr>
         <w:pStyle w:val="Ttulo2"/>
       </w:pPr>
-      <w:bookmarkStart w:id="6" w:name="_Toc241917354"/>
+      <w:bookmarkStart w:id="6" w:name="_Toc241925011"/>
       <w:r>
         <w:t>3.1 Requisitos funcionais</w:t>
       </w:r>
@@ -3675,7 +3818,7 @@
       <w:pPr>
         <w:pStyle w:val="Ttulo2"/>
       </w:pPr>
-      <w:bookmarkStart w:id="7" w:name="_Toc241917355"/>
+      <w:bookmarkStart w:id="7" w:name="_Toc241925012"/>
       <w:r>
         <w:t>3.2 Requisitos não funcionais</w:t>
       </w:r>
@@ -4424,7 +4567,7 @@
       <w:pPr>
         <w:pStyle w:val="Ttulo2"/>
       </w:pPr>
-      <w:bookmarkStart w:id="8" w:name="_Toc241917356"/>
+      <w:bookmarkStart w:id="8" w:name="_Toc241925013"/>
       <w:r>
         <w:t>3.3 Regras de negócio e simulação</w:t>
       </w:r>
@@ -5090,7 +5233,7 @@
       <w:pPr>
         <w:pStyle w:val="Ttulo1"/>
       </w:pPr>
-      <w:bookmarkStart w:id="9" w:name="_Toc241917357"/>
+      <w:bookmarkStart w:id="9" w:name="_Toc241925014"/>
       <w:r>
         <w:lastRenderedPageBreak/>
         <w:t>4 MODELAGEM E ARQUITETURA</w:t>
@@ -5177,7 +5320,7 @@
       <w:pPr>
         <w:pStyle w:val="Ttulo2"/>
       </w:pPr>
-      <w:bookmarkStart w:id="10" w:name="_Toc241917358"/>
+      <w:bookmarkStart w:id="10" w:name="_Toc241925015"/>
       <w:r>
         <w:t>4.1 Casos de uso</w:t>
       </w:r>
@@ -6235,7 +6378,7 @@
       <w:pPr>
         <w:pStyle w:val="Ttulo2"/>
       </w:pPr>
-      <w:bookmarkStart w:id="11" w:name="_Toc241917359"/>
+      <w:bookmarkStart w:id="11" w:name="_Toc241925016"/>
       <w:r>
         <w:t>4.2 Arquitetura do protótipo</w:t>
       </w:r>
@@ -6327,7 +6470,7 @@
       <w:pPr>
         <w:pStyle w:val="Ttulo2"/>
       </w:pPr>
-      <w:bookmarkStart w:id="12" w:name="_Toc241917360"/>
+      <w:bookmarkStart w:id="12" w:name="_Toc241925017"/>
       <w:r>
         <w:t>4.3 Rastreabilidade</w:t>
       </w:r>
@@ -6922,7 +7065,7 @@
       <w:pPr>
         <w:pStyle w:val="Ttulo1"/>
       </w:pPr>
-      <w:bookmarkStart w:id="13" w:name="_Toc241917361"/>
+      <w:bookmarkStart w:id="13" w:name="_Toc241925018"/>
       <w:r>
         <w:lastRenderedPageBreak/>
         <w:t>5 PROTÓTIPO E FLUXOS DE USO</w:t>
@@ -6938,7 +7081,7 @@
       <w:pPr>
         <w:pStyle w:val="Ttulo2"/>
       </w:pPr>
-      <w:bookmarkStart w:id="14" w:name="_Toc241917362"/>
+      <w:bookmarkStart w:id="14" w:name="_Toc241925019"/>
       <w:r>
         <w:t>5.1 Consulta e planejamento de visitas</w:t>
       </w:r>
@@ -6956,7 +7099,7 @@
       <w:pPr>
         <w:pStyle w:val="Ttulo2"/>
       </w:pPr>
-      <w:bookmarkStart w:id="15" w:name="_Toc241917363"/>
+      <w:bookmarkStart w:id="15" w:name="_Toc241925020"/>
       <w:r>
         <w:t>5.2 Geração e comparação de rotas</w:t>
       </w:r>
@@ -6980,7 +7123,7 @@
         <w:pStyle w:val="Ttulo2"/>
         <w:pageBreakBefore/>
       </w:pPr>
-      <w:bookmarkStart w:id="16" w:name="_Toc241917364"/>
+      <w:bookmarkStart w:id="16" w:name="_Toc241925021"/>
       <w:r>
         <w:lastRenderedPageBreak/>
         <w:t>5.3 Cobertura e indicadores</w:t>
@@ -7001,7 +7144,7 @@
       <w:pPr>
         <w:pStyle w:val="Ttulo1"/>
       </w:pPr>
-      <w:bookmarkStart w:id="17" w:name="_Toc241917365"/>
+      <w:bookmarkStart w:id="17" w:name="_Toc241925022"/>
       <w:r>
         <w:lastRenderedPageBreak/>
         <w:t>6 AVALIAÇÃO DE USABILIDADE E VERIFICAÇÃO</w:t>
@@ -8353,7 +8496,7 @@
       <w:pPr>
         <w:pStyle w:val="Ttulo1"/>
       </w:pPr>
-      <w:bookmarkStart w:id="18" w:name="_Toc241917366"/>
+      <w:bookmarkStart w:id="18" w:name="_Toc241925023"/>
       <w:r>
         <w:lastRenderedPageBreak/>
         <w:t>7 SUSTENTABILIDADE E SEGURANÇA</w:t>
@@ -8362,7 +8505,15 @@
     </w:p>
     <w:p>
       <w:r>
-        <w:t>A comparação de sequências permite discutir deslocamentos menores e agrupamento de visitas, mas não comprova redução real de emissões, combustível ou custos. Uma avaliação operacional exigiria trajetos reais autorizados, linha de base comparável e método de medição. No projeto, os resultados são exclusivamente didáticos.</w:t>
+        <w:t>A proposta do Liveb GEO considera a preocupação ambiental ao permitir planejar visitas por região e comparar sequências de deslocamento. Os requisitos RF07, RF08 e RF09 apoiam a organização das paradas e a escolha consciente de trajetos. Em uma aplicação operacional, esse planejamento pode evitar deslocamentos desnecessários e contribuir para reduzir o consumo de combustível e as emissões associadas às visitas, desde que as alternativas sejam comparáveis e atendam às necessidades do serviço.</w:t>
+      </w:r>
+    </w:p>
+    <w:p>
+      <w:r>
+        <w:t>No protótipo, as distâncias e os tempos são fictícios; portanto, a diferença entre duas rotas não comprova redução real de emissões ou de consumo. Uma avaliação ambiental futura deverá comparar trajetos para o mesmo conjunto de visitas, registrar a distância efetivamente percorrida e o combustível consumido e declarar o método de estimativa de emissões. A contribuição acadêmica é especificar funções que apoiem esse planejamento e tornar seus limites explícitos, sem apresentar benefícios ambientais simulados</w:t>
+      </w:r>
+      <w:r>
+        <w:t xml:space="preserve"> como resultados da empresa.</w:t>
       </w:r>
     </w:p>
     <w:p>
@@ -8379,7 +8530,7 @@
       <w:pPr>
         <w:pStyle w:val="Ttulo1"/>
       </w:pPr>
-      <w:bookmarkStart w:id="19" w:name="_Toc241917367"/>
+      <w:bookmarkStart w:id="19" w:name="_Toc241925024"/>
       <w:r>
         <w:lastRenderedPageBreak/>
         <w:t>8 CONCLUSÃO</w:t>
@@ -8401,7 +8552,7 @@
         <w:pStyle w:val="Ttulo1"/>
         <w:jc w:val="center"/>
       </w:pPr>
-      <w:bookmarkStart w:id="20" w:name="_Toc241917368"/>
+      <w:bookmarkStart w:id="20" w:name="_Toc241925025"/>
       <w:r>
         <w:lastRenderedPageBreak/>
         <w:t>REFERÊNCIAS</w:t>
@@ -8463,7 +8614,7 @@
         <w:pStyle w:val="Ttulo1"/>
         <w:jc w:val="center"/>
       </w:pPr>
-      <w:bookmarkStart w:id="21" w:name="_Toc241917369"/>
+      <w:bookmarkStart w:id="21" w:name="_Toc241925026"/>
       <w:r>
         <w:lastRenderedPageBreak/>
         <w:t>APÊNDICE A - SÍNTESE DA ENTREVISTA</w:t>
@@ -8929,7 +9080,7 @@
         <w:pStyle w:val="Ttulo1"/>
         <w:jc w:val="center"/>
       </w:pPr>
-      <w:bookmarkStart w:id="22" w:name="_Toc241917370"/>
+      <w:bookmarkStart w:id="22" w:name="_Toc241925027"/>
       <w:r>
         <w:lastRenderedPageBreak/>
         <w:t>ANEXO A - TELAS DO PROTÓTIPO</w:t>
@@ -11090,6 +11241,7 @@
       <w:numPr>
         <w:ilvl w:val="1"/>
       </w:numPr>
+      <w:ind w:firstLine="709"/>
     </w:pPr>
     <w:rPr>
       <w:i/>

</xml_diff>